<commit_message>
Update STEPS PODCAST -  CREATING A WEBSITE WITH DOCKER - INSTALLED SOFTWARE  v1.1.docx
</commit_message>
<xml_diff>
--- a/Steps PodCast/CREATING A WEBSITE WITH DOCKER/STEPS PODCAST -  CREATING A WEBSITE WITH DOCKER - INSTALLED SOFTWARE  v1.1.docx
+++ b/Steps PodCast/CREATING A WEBSITE WITH DOCKER/STEPS PODCAST -  CREATING A WEBSITE WITH DOCKER - INSTALLED SOFTWARE  v1.1.docx
@@ -510,7 +510,7 @@
           <w:r>
             <w:fldChar w:fldCharType="separate"/>
           </w:r>
-          <w:hyperlink w:anchor="_Toc185339142" w:history="1">
+          <w:hyperlink w:anchor="_Toc185429645" w:history="1">
             <w:r>
               <w:rPr>
                 <w:rStyle w:val="Hyperlink"/>
@@ -537,7 +537,7 @@
                 <w:noProof/>
                 <w:webHidden/>
               </w:rPr>
-              <w:instrText xml:space="preserve"> PAGEREF _Toc185339142 \h </w:instrText>
+              <w:instrText xml:space="preserve"> PAGEREF _Toc185429645 \h </w:instrText>
             </w:r>
             <w:r>
               <w:rPr>
@@ -579,7 +579,7 @@
               <w:noProof/>
             </w:rPr>
           </w:pPr>
-          <w:hyperlink w:anchor="_Toc185339143" w:history="1">
+          <w:hyperlink w:anchor="_Toc185429646" w:history="1">
             <w:r>
               <w:rPr>
                 <w:rStyle w:val="Hyperlink"/>
@@ -606,7 +606,7 @@
                 <w:noProof/>
                 <w:webHidden/>
               </w:rPr>
-              <w:instrText xml:space="preserve"> PAGEREF _Toc185339143 \h </w:instrText>
+              <w:instrText xml:space="preserve"> PAGEREF _Toc185429646 \h </w:instrText>
             </w:r>
             <w:r>
               <w:rPr>
@@ -648,7 +648,7 @@
               <w:noProof/>
             </w:rPr>
           </w:pPr>
-          <w:hyperlink w:anchor="_Toc185339144" w:history="1">
+          <w:hyperlink w:anchor="_Toc185429647" w:history="1">
             <w:r>
               <w:rPr>
                 <w:rStyle w:val="Hyperlink"/>
@@ -675,7 +675,7 @@
                 <w:noProof/>
                 <w:webHidden/>
               </w:rPr>
-              <w:instrText xml:space="preserve"> PAGEREF _Toc185339144 \h </w:instrText>
+              <w:instrText xml:space="preserve"> PAGEREF _Toc185429647 \h </w:instrText>
             </w:r>
             <w:r>
               <w:rPr>
@@ -717,7 +717,7 @@
               <w:noProof/>
             </w:rPr>
           </w:pPr>
-          <w:hyperlink w:anchor="_Toc185339145" w:history="1">
+          <w:hyperlink w:anchor="_Toc185429648" w:history="1">
             <w:r>
               <w:rPr>
                 <w:rStyle w:val="Hyperlink"/>
@@ -744,7 +744,7 @@
                 <w:noProof/>
                 <w:webHidden/>
               </w:rPr>
-              <w:instrText xml:space="preserve"> PAGEREF _Toc185339145 \h </w:instrText>
+              <w:instrText xml:space="preserve"> PAGEREF _Toc185429648 \h </w:instrText>
             </w:r>
             <w:r>
               <w:rPr>
@@ -786,7 +786,7 @@
               <w:noProof/>
             </w:rPr>
           </w:pPr>
-          <w:hyperlink w:anchor="_Toc185339146" w:history="1">
+          <w:hyperlink w:anchor="_Toc185429649" w:history="1">
             <w:r>
               <w:rPr>
                 <w:rStyle w:val="Hyperlink"/>
@@ -813,7 +813,7 @@
                 <w:noProof/>
                 <w:webHidden/>
               </w:rPr>
-              <w:instrText xml:space="preserve"> PAGEREF _Toc185339146 \h </w:instrText>
+              <w:instrText xml:space="preserve"> PAGEREF _Toc185429649 \h </w:instrText>
             </w:r>
             <w:r>
               <w:rPr>
@@ -855,7 +855,7 @@
               <w:noProof/>
             </w:rPr>
           </w:pPr>
-          <w:hyperlink w:anchor="_Toc185339147" w:history="1">
+          <w:hyperlink w:anchor="_Toc185429650" w:history="1">
             <w:r>
               <w:rPr>
                 <w:rStyle w:val="Hyperlink"/>
@@ -882,7 +882,7 @@
                 <w:noProof/>
                 <w:webHidden/>
               </w:rPr>
-              <w:instrText xml:space="preserve"> PAGEREF _Toc185339147 \h </w:instrText>
+              <w:instrText xml:space="preserve"> PAGEREF _Toc185429650 \h </w:instrText>
             </w:r>
             <w:r>
               <w:rPr>
@@ -924,7 +924,7 @@
               <w:noProof/>
             </w:rPr>
           </w:pPr>
-          <w:hyperlink w:anchor="_Toc185339148" w:history="1">
+          <w:hyperlink w:anchor="_Toc185429651" w:history="1">
             <w:r>
               <w:rPr>
                 <w:rStyle w:val="Hyperlink"/>
@@ -951,7 +951,7 @@
                 <w:noProof/>
                 <w:webHidden/>
               </w:rPr>
-              <w:instrText xml:space="preserve"> PAGEREF _Toc185339148 \h </w:instrText>
+              <w:instrText xml:space="preserve"> PAGEREF _Toc185429651 \h </w:instrText>
             </w:r>
             <w:r>
               <w:rPr>
@@ -993,7 +993,7 @@
               <w:noProof/>
             </w:rPr>
           </w:pPr>
-          <w:hyperlink w:anchor="_Toc185339149" w:history="1">
+          <w:hyperlink w:anchor="_Toc185429652" w:history="1">
             <w:r>
               <w:rPr>
                 <w:rStyle w:val="Hyperlink"/>
@@ -1020,7 +1020,7 @@
                 <w:noProof/>
                 <w:webHidden/>
               </w:rPr>
-              <w:instrText xml:space="preserve"> PAGEREF _Toc185339149 \h </w:instrText>
+              <w:instrText xml:space="preserve"> PAGEREF _Toc185429652 \h </w:instrText>
             </w:r>
             <w:r>
               <w:rPr>
@@ -1062,7 +1062,7 @@
               <w:noProof/>
             </w:rPr>
           </w:pPr>
-          <w:hyperlink w:anchor="_Toc185339150" w:history="1">
+          <w:hyperlink w:anchor="_Toc185429653" w:history="1">
             <w:r>
               <w:rPr>
                 <w:rStyle w:val="Hyperlink"/>
@@ -1089,7 +1089,7 @@
                 <w:noProof/>
                 <w:webHidden/>
               </w:rPr>
-              <w:instrText xml:space="preserve"> PAGEREF _Toc185339150 \h </w:instrText>
+              <w:instrText xml:space="preserve"> PAGEREF _Toc185429653 \h </w:instrText>
             </w:r>
             <w:r>
               <w:rPr>
@@ -1131,7 +1131,7 @@
               <w:noProof/>
             </w:rPr>
           </w:pPr>
-          <w:hyperlink w:anchor="_Toc185339151" w:history="1">
+          <w:hyperlink w:anchor="_Toc185429654" w:history="1">
             <w:r>
               <w:rPr>
                 <w:rStyle w:val="Hyperlink"/>
@@ -1158,7 +1158,7 @@
                 <w:noProof/>
                 <w:webHidden/>
               </w:rPr>
-              <w:instrText xml:space="preserve"> PAGEREF _Toc185339151 \h </w:instrText>
+              <w:instrText xml:space="preserve"> PAGEREF _Toc185429654 \h </w:instrText>
             </w:r>
             <w:r>
               <w:rPr>
@@ -1200,7 +1200,7 @@
               <w:noProof/>
             </w:rPr>
           </w:pPr>
-          <w:hyperlink w:anchor="_Toc185339152" w:history="1">
+          <w:hyperlink w:anchor="_Toc185429655" w:history="1">
             <w:r>
               <w:rPr>
                 <w:rStyle w:val="Hyperlink"/>
@@ -1227,7 +1227,7 @@
                 <w:noProof/>
                 <w:webHidden/>
               </w:rPr>
-              <w:instrText xml:space="preserve"> PAGEREF _Toc185339152 \h </w:instrText>
+              <w:instrText xml:space="preserve"> PAGEREF _Toc185429655 \h </w:instrText>
             </w:r>
             <w:r>
               <w:rPr>
@@ -1269,7 +1269,7 @@
               <w:noProof/>
             </w:rPr>
           </w:pPr>
-          <w:hyperlink w:anchor="_Toc185339153" w:history="1">
+          <w:hyperlink w:anchor="_Toc185429656" w:history="1">
             <w:r>
               <w:rPr>
                 <w:rStyle w:val="Hyperlink"/>
@@ -1296,7 +1296,7 @@
                 <w:noProof/>
                 <w:webHidden/>
               </w:rPr>
-              <w:instrText xml:space="preserve"> PAGEREF _Toc185339153 \h </w:instrText>
+              <w:instrText xml:space="preserve"> PAGEREF _Toc185429656 \h </w:instrText>
             </w:r>
             <w:r>
               <w:rPr>
@@ -1338,7 +1338,7 @@
               <w:noProof/>
             </w:rPr>
           </w:pPr>
-          <w:hyperlink w:anchor="_Toc185339154" w:history="1">
+          <w:hyperlink w:anchor="_Toc185429657" w:history="1">
             <w:r>
               <w:rPr>
                 <w:rStyle w:val="Hyperlink"/>
@@ -1365,7 +1365,7 @@
                 <w:noProof/>
                 <w:webHidden/>
               </w:rPr>
-              <w:instrText xml:space="preserve"> PAGEREF _Toc185339154 \h </w:instrText>
+              <w:instrText xml:space="preserve"> PAGEREF _Toc185429657 \h </w:instrText>
             </w:r>
             <w:r>
               <w:rPr>
@@ -1407,7 +1407,7 @@
               <w:noProof/>
             </w:rPr>
           </w:pPr>
-          <w:hyperlink w:anchor="_Toc185339155" w:history="1">
+          <w:hyperlink w:anchor="_Toc185429658" w:history="1">
             <w:r>
               <w:rPr>
                 <w:rStyle w:val="Hyperlink"/>
@@ -1434,7 +1434,7 @@
                 <w:noProof/>
                 <w:webHidden/>
               </w:rPr>
-              <w:instrText xml:space="preserve"> PAGEREF _Toc185339155 \h </w:instrText>
+              <w:instrText xml:space="preserve"> PAGEREF _Toc185429658 \h </w:instrText>
             </w:r>
             <w:r>
               <w:rPr>
@@ -1476,7 +1476,7 @@
               <w:noProof/>
             </w:rPr>
           </w:pPr>
-          <w:hyperlink w:anchor="_Toc185339156" w:history="1">
+          <w:hyperlink w:anchor="_Toc185429659" w:history="1">
             <w:r>
               <w:rPr>
                 <w:rStyle w:val="Hyperlink"/>
@@ -1503,7 +1503,7 @@
                 <w:noProof/>
                 <w:webHidden/>
               </w:rPr>
-              <w:instrText xml:space="preserve"> PAGEREF _Toc185339156 \h </w:instrText>
+              <w:instrText xml:space="preserve"> PAGEREF _Toc185429659 \h </w:instrText>
             </w:r>
             <w:r>
               <w:rPr>
@@ -1545,7 +1545,7 @@
               <w:noProof/>
             </w:rPr>
           </w:pPr>
-          <w:hyperlink w:anchor="_Toc185339157" w:history="1">
+          <w:hyperlink w:anchor="_Toc185429660" w:history="1">
             <w:r>
               <w:rPr>
                 <w:rStyle w:val="Hyperlink"/>
@@ -1572,7 +1572,7 @@
                 <w:noProof/>
                 <w:webHidden/>
               </w:rPr>
-              <w:instrText xml:space="preserve"> PAGEREF _Toc185339157 \h </w:instrText>
+              <w:instrText xml:space="preserve"> PAGEREF _Toc185429660 \h </w:instrText>
             </w:r>
             <w:r>
               <w:rPr>
@@ -1614,7 +1614,7 @@
               <w:noProof/>
             </w:rPr>
           </w:pPr>
-          <w:hyperlink w:anchor="_Toc185339158" w:history="1">
+          <w:hyperlink w:anchor="_Toc185429661" w:history="1">
             <w:r>
               <w:rPr>
                 <w:rStyle w:val="Hyperlink"/>
@@ -1641,7 +1641,7 @@
                 <w:noProof/>
                 <w:webHidden/>
               </w:rPr>
-              <w:instrText xml:space="preserve"> PAGEREF _Toc185339158 \h </w:instrText>
+              <w:instrText xml:space="preserve"> PAGEREF _Toc185429661 \h </w:instrText>
             </w:r>
             <w:r>
               <w:rPr>
@@ -1683,7 +1683,7 @@
               <w:noProof/>
             </w:rPr>
           </w:pPr>
-          <w:hyperlink w:anchor="_Toc185339159" w:history="1">
+          <w:hyperlink w:anchor="_Toc185429662" w:history="1">
             <w:r>
               <w:rPr>
                 <w:rStyle w:val="Hyperlink"/>
@@ -1710,7 +1710,7 @@
                 <w:noProof/>
                 <w:webHidden/>
               </w:rPr>
-              <w:instrText xml:space="preserve"> PAGEREF _Toc185339159 \h </w:instrText>
+              <w:instrText xml:space="preserve"> PAGEREF _Toc185429662 \h </w:instrText>
             </w:r>
             <w:r>
               <w:rPr>
@@ -1731,6 +1731,75 @@
                 <w:webHidden/>
               </w:rPr>
               <w:t>18</w:t>
+            </w:r>
+            <w:r>
+              <w:rPr>
+                <w:noProof/>
+                <w:webHidden/>
+              </w:rPr>
+              <w:fldChar w:fldCharType="end"/>
+            </w:r>
+          </w:hyperlink>
+        </w:p>
+        <w:p>
+          <w:pPr>
+            <w:pStyle w:val="TOC3"/>
+            <w:tabs>
+              <w:tab w:val="right" w:leader="dot" w:pos="9350"/>
+            </w:tabs>
+            <w:rPr>
+              <w:rFonts w:eastAsiaTheme="minorEastAsia"/>
+              <w:noProof/>
+            </w:rPr>
+          </w:pPr>
+          <w:hyperlink w:anchor="_Toc185429663" w:history="1">
+            <w:r>
+              <w:rPr>
+                <w:rStyle w:val="Hyperlink"/>
+                <w:noProof/>
+              </w:rPr>
+              <w:t>Images Menu</w:t>
+            </w:r>
+            <w:r>
+              <w:rPr>
+                <w:noProof/>
+                <w:webHidden/>
+              </w:rPr>
+              <w:tab/>
+            </w:r>
+            <w:r>
+              <w:rPr>
+                <w:noProof/>
+                <w:webHidden/>
+              </w:rPr>
+              <w:fldChar w:fldCharType="begin"/>
+            </w:r>
+            <w:r>
+              <w:rPr>
+                <w:noProof/>
+                <w:webHidden/>
+              </w:rPr>
+              <w:instrText xml:space="preserve"> PAGEREF _Toc185429663 \h </w:instrText>
+            </w:r>
+            <w:r>
+              <w:rPr>
+                <w:noProof/>
+                <w:webHidden/>
+              </w:rPr>
+            </w:r>
+            <w:r>
+              <w:rPr>
+                <w:noProof/>
+                <w:webHidden/>
+              </w:rPr>
+              <w:fldChar w:fldCharType="separate"/>
+            </w:r>
+            <w:r>
+              <w:rPr>
+                <w:noProof/>
+                <w:webHidden/>
+              </w:rPr>
+              <w:t>19</w:t>
             </w:r>
             <w:r>
               <w:rPr>
@@ -1752,7 +1821,7 @@
               <w:noProof/>
             </w:rPr>
           </w:pPr>
-          <w:hyperlink w:anchor="_Toc185339160" w:history="1">
+          <w:hyperlink w:anchor="_Toc185429664" w:history="1">
             <w:r>
               <w:rPr>
                 <w:rStyle w:val="Hyperlink"/>
@@ -1779,7 +1848,7 @@
                 <w:noProof/>
                 <w:webHidden/>
               </w:rPr>
-              <w:instrText xml:space="preserve"> PAGEREF _Toc185339160 \h </w:instrText>
+              <w:instrText xml:space="preserve"> PAGEREF _Toc185429664 \h </w:instrText>
             </w:r>
             <w:r>
               <w:rPr>
@@ -1821,7 +1890,7 @@
               <w:noProof/>
             </w:rPr>
           </w:pPr>
-          <w:hyperlink w:anchor="_Toc185339161" w:history="1">
+          <w:hyperlink w:anchor="_Toc185429665" w:history="1">
             <w:r>
               <w:rPr>
                 <w:rStyle w:val="Hyperlink"/>
@@ -1848,7 +1917,7 @@
                 <w:noProof/>
                 <w:webHidden/>
               </w:rPr>
-              <w:instrText xml:space="preserve"> PAGEREF _Toc185339161 \h </w:instrText>
+              <w:instrText xml:space="preserve"> PAGEREF _Toc185429665 \h </w:instrText>
             </w:r>
             <w:r>
               <w:rPr>
@@ -1890,7 +1959,7 @@
               <w:noProof/>
             </w:rPr>
           </w:pPr>
-          <w:hyperlink w:anchor="_Toc185339162" w:history="1">
+          <w:hyperlink w:anchor="_Toc185429666" w:history="1">
             <w:r>
               <w:rPr>
                 <w:rStyle w:val="Hyperlink"/>
@@ -1917,7 +1986,7 @@
                 <w:noProof/>
                 <w:webHidden/>
               </w:rPr>
-              <w:instrText xml:space="preserve"> PAGEREF _Toc185339162 \h </w:instrText>
+              <w:instrText xml:space="preserve"> PAGEREF _Toc185429666 \h </w:instrText>
             </w:r>
             <w:r>
               <w:rPr>
@@ -1959,7 +2028,7 @@
               <w:noProof/>
             </w:rPr>
           </w:pPr>
-          <w:hyperlink w:anchor="_Toc185339163" w:history="1">
+          <w:hyperlink w:anchor="_Toc185429667" w:history="1">
             <w:r>
               <w:rPr>
                 <w:rStyle w:val="Hyperlink"/>
@@ -1986,7 +2055,7 @@
                 <w:noProof/>
                 <w:webHidden/>
               </w:rPr>
-              <w:instrText xml:space="preserve"> PAGEREF _Toc185339163 \h </w:instrText>
+              <w:instrText xml:space="preserve"> PAGEREF _Toc185429667 \h </w:instrText>
             </w:r>
             <w:r>
               <w:rPr>
@@ -2028,7 +2097,7 @@
               <w:noProof/>
             </w:rPr>
           </w:pPr>
-          <w:hyperlink w:anchor="_Toc185339164" w:history="1">
+          <w:hyperlink w:anchor="_Toc185429668" w:history="1">
             <w:r>
               <w:rPr>
                 <w:rStyle w:val="Hyperlink"/>
@@ -2055,7 +2124,7 @@
                 <w:noProof/>
                 <w:webHidden/>
               </w:rPr>
-              <w:instrText xml:space="preserve"> PAGEREF _Toc185339164 \h </w:instrText>
+              <w:instrText xml:space="preserve"> PAGEREF _Toc185429668 \h </w:instrText>
             </w:r>
             <w:r>
               <w:rPr>
@@ -2097,7 +2166,7 @@
               <w:noProof/>
             </w:rPr>
           </w:pPr>
-          <w:hyperlink w:anchor="_Toc185339165" w:history="1">
+          <w:hyperlink w:anchor="_Toc185429669" w:history="1">
             <w:r>
               <w:rPr>
                 <w:rStyle w:val="Hyperlink"/>
@@ -2124,7 +2193,7 @@
                 <w:noProof/>
                 <w:webHidden/>
               </w:rPr>
-              <w:instrText xml:space="preserve"> PAGEREF _Toc185339165 \h </w:instrText>
+              <w:instrText xml:space="preserve"> PAGEREF _Toc185429669 \h </w:instrText>
             </w:r>
             <w:r>
               <w:rPr>
@@ -2166,7 +2235,7 @@
               <w:noProof/>
             </w:rPr>
           </w:pPr>
-          <w:hyperlink w:anchor="_Toc185339166" w:history="1">
+          <w:hyperlink w:anchor="_Toc185429670" w:history="1">
             <w:r>
               <w:rPr>
                 <w:rStyle w:val="Hyperlink"/>
@@ -2193,7 +2262,7 @@
                 <w:noProof/>
                 <w:webHidden/>
               </w:rPr>
-              <w:instrText xml:space="preserve"> PAGEREF _Toc185339166 \h </w:instrText>
+              <w:instrText xml:space="preserve"> PAGEREF _Toc185429670 \h </w:instrText>
             </w:r>
             <w:r>
               <w:rPr>
@@ -2235,7 +2304,7 @@
               <w:noProof/>
             </w:rPr>
           </w:pPr>
-          <w:hyperlink w:anchor="_Toc185339167" w:history="1">
+          <w:hyperlink w:anchor="_Toc185429671" w:history="1">
             <w:r>
               <w:rPr>
                 <w:rStyle w:val="Hyperlink"/>
@@ -2262,7 +2331,7 @@
                 <w:noProof/>
                 <w:webHidden/>
               </w:rPr>
-              <w:instrText xml:space="preserve"> PAGEREF _Toc185339167 \h </w:instrText>
+              <w:instrText xml:space="preserve"> PAGEREF _Toc185429671 \h </w:instrText>
             </w:r>
             <w:r>
               <w:rPr>
@@ -2335,7 +2404,7 @@
         <w:pStyle w:val="Heading1"/>
       </w:pPr>
       <w:bookmarkStart w:id="0" w:name="_Toc183807700"/>
-      <w:bookmarkStart w:id="1" w:name="_Toc185339142"/>
+      <w:bookmarkStart w:id="1" w:name="_Toc185429645"/>
       <w:r>
         <w:lastRenderedPageBreak/>
         <w:t>Installed Software</w:t>
@@ -2354,7 +2423,7 @@
       <w:r>
         <w:t xml:space="preserve"> </w:t>
       </w:r>
-      <w:bookmarkStart w:id="3" w:name="_Toc185339143"/>
+      <w:bookmarkStart w:id="3" w:name="_Toc185429646"/>
       <w:r>
         <w:t>Introduction</w:t>
       </w:r>
@@ -2394,7 +2463,7 @@
         <w:pStyle w:val="Heading2"/>
       </w:pPr>
       <w:bookmarkStart w:id="4" w:name="_Toc183807702"/>
-      <w:bookmarkStart w:id="5" w:name="_Toc185339144"/>
+      <w:bookmarkStart w:id="5" w:name="_Toc185429647"/>
       <w:r>
         <w:t>Git</w:t>
       </w:r>
@@ -2533,7 +2602,7 @@
       <w:pPr>
         <w:pStyle w:val="Heading3"/>
       </w:pPr>
-      <w:bookmarkStart w:id="6" w:name="_Toc185339145"/>
+      <w:bookmarkStart w:id="6" w:name="_Toc185429648"/>
       <w:r>
         <w:t>Check Git Version</w:t>
       </w:r>
@@ -2797,7 +2866,7 @@
         <w:pStyle w:val="Heading2"/>
       </w:pPr>
       <w:bookmarkStart w:id="7" w:name="_Toc183807703"/>
-      <w:bookmarkStart w:id="8" w:name="_Toc185339146"/>
+      <w:bookmarkStart w:id="8" w:name="_Toc185429649"/>
       <w:r>
         <w:t>Source Tree</w:t>
       </w:r>
@@ -2897,7 +2966,7 @@
         <w:pStyle w:val="Heading2"/>
       </w:pPr>
       <w:bookmarkStart w:id="9" w:name="_Toc183807704"/>
-      <w:bookmarkStart w:id="10" w:name="_Toc185339147"/>
+      <w:bookmarkStart w:id="10" w:name="_Toc185429650"/>
       <w:r>
         <w:t>NodeJS and NPM</w:t>
       </w:r>
@@ -3010,7 +3079,7 @@
       <w:pPr>
         <w:pStyle w:val="Heading3"/>
       </w:pPr>
-      <w:bookmarkStart w:id="11" w:name="_Toc185339148"/>
+      <w:bookmarkStart w:id="11" w:name="_Toc185429651"/>
       <w:r>
         <w:t xml:space="preserve">Using NPM to download </w:t>
       </w:r>
@@ -4125,7 +4194,7 @@
         <w:pStyle w:val="Heading2"/>
       </w:pPr>
       <w:bookmarkStart w:id="12" w:name="_Toc183807705"/>
-      <w:bookmarkStart w:id="13" w:name="_Toc185339149"/>
+      <w:bookmarkStart w:id="13" w:name="_Toc185429652"/>
       <w:r>
         <w:lastRenderedPageBreak/>
         <w:t>GitHub Desktop</w:t>
@@ -4271,7 +4340,7 @@
         </w:rPr>
       </w:pPr>
       <w:bookmarkStart w:id="14" w:name="_Toc183807706"/>
-      <w:bookmarkStart w:id="15" w:name="_Toc185339150"/>
+      <w:bookmarkStart w:id="15" w:name="_Toc185429653"/>
       <w:r>
         <w:rPr>
           <w:rStyle w:val="Hyperlink"/>
@@ -4384,7 +4453,7 @@
           <w:rStyle w:val="Hyperlink"/>
         </w:rPr>
       </w:pPr>
-      <w:bookmarkStart w:id="16" w:name="_Toc185339151"/>
+      <w:bookmarkStart w:id="16" w:name="_Toc185429654"/>
       <w:r>
         <w:rPr>
           <w:rStyle w:val="Hyperlink"/>
@@ -5410,7 +5479,7 @@
         </w:rPr>
       </w:pPr>
       <w:bookmarkStart w:id="17" w:name="_Toc183807707"/>
-      <w:bookmarkStart w:id="18" w:name="_Toc185339152"/>
+      <w:bookmarkStart w:id="18" w:name="_Toc185429655"/>
       <w:r>
         <w:rPr>
           <w:rStyle w:val="Hyperlink"/>
@@ -5533,7 +5602,7 @@
       </w:pPr>
       <w:bookmarkStart w:id="19" w:name="_Toc183807740"/>
       <w:bookmarkStart w:id="20" w:name="_Toc185326580"/>
-      <w:bookmarkStart w:id="21" w:name="_Toc185339153"/>
+      <w:bookmarkStart w:id="21" w:name="_Toc185429656"/>
       <w:r>
         <w:t>Docker</w:t>
       </w:r>
@@ -5548,7 +5617,7 @@
       </w:pPr>
       <w:bookmarkStart w:id="22" w:name="_Toc183807741"/>
       <w:bookmarkStart w:id="23" w:name="_Toc185326581"/>
-      <w:bookmarkStart w:id="24" w:name="_Toc185339154"/>
+      <w:bookmarkStart w:id="24" w:name="_Toc185429657"/>
       <w:r>
         <w:t>Introduction</w:t>
       </w:r>
@@ -5708,7 +5777,7 @@
       </w:pPr>
       <w:bookmarkStart w:id="25" w:name="_Toc183807742"/>
       <w:bookmarkStart w:id="26" w:name="_Toc185326582"/>
-      <w:bookmarkStart w:id="27" w:name="_Toc185339155"/>
+      <w:bookmarkStart w:id="27" w:name="_Toc185429658"/>
       <w:r>
         <w:t>Docker File</w:t>
       </w:r>
@@ -6238,7 +6307,7 @@
       </w:pPr>
       <w:bookmarkStart w:id="28" w:name="_Toc183807743"/>
       <w:bookmarkStart w:id="29" w:name="_Toc185326583"/>
-      <w:bookmarkStart w:id="30" w:name="_Toc185339156"/>
+      <w:bookmarkStart w:id="30" w:name="_Toc185429659"/>
       <w:r>
         <w:t>Docker Image</w:t>
       </w:r>
@@ -6371,7 +6440,7 @@
       </w:pPr>
       <w:bookmarkStart w:id="31" w:name="_Toc183807744"/>
       <w:bookmarkStart w:id="32" w:name="_Toc185326584"/>
-      <w:bookmarkStart w:id="33" w:name="_Toc185339157"/>
+      <w:bookmarkStart w:id="33" w:name="_Toc185429660"/>
       <w:r>
         <w:t>Docker Container</w:t>
       </w:r>
@@ -6496,48 +6565,41 @@
           <w:b/>
           <w:bCs/>
         </w:rPr>
-        <w:t xml:space="preserve"> </w:t>
+        <w:t xml:space="preserve"> Docker Daemon </w:t>
       </w:r>
       <w:r>
         <w:rPr>
           <w:b/>
           <w:bCs/>
         </w:rPr>
-        <w:t xml:space="preserve">Docker Daemon </w:t>
+        <w:t>takes the commands a developer enters the Docker client terminal and executes them</w:t>
+      </w:r>
+      <w:r>
+        <w:t>.</w:t>
+      </w:r>
+    </w:p>
+    <w:p>
+      <w:pPr>
+        <w:jc w:val="both"/>
+      </w:pPr>
+      <w:r>
+        <w:t xml:space="preserve">This </w:t>
       </w:r>
       <w:r>
         <w:rPr>
           <w:b/>
           <w:bCs/>
         </w:rPr>
-        <w:t>takes the commands a developer enters the Docker client terminal and executes them</w:t>
-      </w:r>
-      <w:r>
-        <w:t>.</w:t>
-      </w:r>
-    </w:p>
-    <w:p>
-      <w:pPr>
-        <w:jc w:val="both"/>
-      </w:pPr>
-      <w:r>
-        <w:t xml:space="preserve">This </w:t>
+        <w:t>approach allows pieces of code</w:t>
+      </w:r>
+      <w:r>
+        <w:t xml:space="preserve"> </w:t>
       </w:r>
       <w:r>
         <w:rPr>
           <w:b/>
           <w:bCs/>
         </w:rPr>
-        <w:t>approach allows pieces of code</w:t>
-      </w:r>
-      <w:r>
-        <w:t xml:space="preserve"> </w:t>
-      </w:r>
-      <w:r>
-        <w:rPr>
-          <w:b/>
-          <w:bCs/>
-        </w:rPr>
         <w:t>to be put into smaller, easily transportable pieces</w:t>
       </w:r>
       <w:r>
@@ -6556,7 +6618,7 @@
       </w:pPr>
       <w:bookmarkStart w:id="34" w:name="_Toc183807745"/>
       <w:bookmarkStart w:id="35" w:name="_Toc185326585"/>
-      <w:bookmarkStart w:id="36" w:name="_Toc185339158"/>
+      <w:bookmarkStart w:id="36" w:name="_Toc185429661"/>
       <w:r>
         <w:t>Docker Compose</w:t>
       </w:r>
@@ -6741,7 +6803,7 @@
       </w:pPr>
       <w:bookmarkStart w:id="37" w:name="_Toc183807746"/>
       <w:bookmarkStart w:id="38" w:name="_Toc185326586"/>
-      <w:bookmarkStart w:id="39" w:name="_Toc185339159"/>
+      <w:bookmarkStart w:id="39" w:name="_Toc185429662"/>
       <w:r>
         <w:t>Create the Image</w:t>
       </w:r>
@@ -6754,73 +6816,111 @@
         <w:t xml:space="preserve">In the </w:t>
       </w:r>
       <w:r>
+        <w:t>README</w:t>
+      </w:r>
+      <w:r>
+        <w:t xml:space="preserve"> file on GitHub, there is a section titled </w:t>
+      </w:r>
+      <w:r>
+        <w:t xml:space="preserve">Usage </w:t>
+      </w:r>
+      <w:r>
+        <w:t>Instructions</w:t>
+      </w:r>
+      <w:r>
+        <w:t xml:space="preserve"> where I explain </w:t>
+      </w:r>
+      <w:r>
+        <w:t xml:space="preserve">how to </w:t>
+      </w:r>
+      <w:r>
         <w:rPr>
           <w:b/>
           <w:bCs/>
         </w:rPr>
-        <w:t>README</w:t>
-      </w:r>
-      <w:r>
-        <w:t xml:space="preserve"> file on GitHub, there is a section titled ‘</w:t>
+        <w:t>B</w:t>
       </w:r>
       <w:r>
         <w:rPr>
           <w:b/>
           <w:bCs/>
         </w:rPr>
-        <w:t>Usage Instructions</w:t>
-      </w:r>
-      <w:r>
-        <w:t xml:space="preserve">’ where I explain </w:t>
+        <w:t>uild the Docker image</w:t>
+      </w:r>
+      <w:r>
+        <w:t>. Below, I will detail the Docker command used to build the image</w:t>
+      </w:r>
+      <w:r>
+        <w:t xml:space="preserve">. </w:t>
+      </w:r>
+    </w:p>
+    <w:p>
+      <w:r>
+        <w:t>The command </w:t>
       </w:r>
       <w:r>
         <w:rPr>
           <w:b/>
           <w:bCs/>
         </w:rPr>
-        <w:t>how to build the Docker image</w:t>
-      </w:r>
-      <w:r>
-        <w:t>. Below, I will detail the Docker command used to build the image</w:t>
-      </w:r>
-      <w:r>
-        <w:t xml:space="preserve">. </w:t>
-      </w:r>
-    </w:p>
-    <w:p>
-      <w:r>
-        <w:t>The command </w:t>
-      </w:r>
+        <w:t xml:space="preserve">docker </w:t>
+      </w:r>
+      <w:proofErr w:type="gramStart"/>
       <w:r>
         <w:rPr>
           <w:b/>
           <w:bCs/>
-        </w:rPr>
-        <w:t xml:space="preserve">docker </w:t>
-      </w:r>
-      <w:proofErr w:type="gramStart"/>
+          <w:color w:val="153D63" w:themeColor="text2" w:themeTint="E6"/>
+        </w:rPr>
+        <w:t>build</w:t>
+      </w:r>
       <w:r>
         <w:rPr>
           <w:b/>
           <w:bCs/>
         </w:rPr>
-        <w:t>build -t</w:t>
-      </w:r>
-      <w:proofErr w:type="gramEnd"/>
+        <w:t xml:space="preserve"> </w:t>
+      </w:r>
       <w:r>
         <w:rPr>
           <w:b/>
           <w:bCs/>
-        </w:rPr>
-        <w:t xml:space="preserve"> node-docker-</w:t>
-      </w:r>
-      <w:proofErr w:type="gramStart"/>
+          <w:color w:val="BF4E14" w:themeColor="accent2" w:themeShade="BF"/>
+        </w:rPr>
+        <w:t>-t</w:t>
+      </w:r>
+      <w:proofErr w:type="gramEnd"/>
       <w:r>
         <w:rPr>
           <w:b/>
           <w:bCs/>
-        </w:rPr>
-        <w:t>app .</w:t>
+          <w:color w:val="BF4E14" w:themeColor="accent2" w:themeShade="BF"/>
+        </w:rPr>
+        <w:t xml:space="preserve"> node-docker-</w:t>
+      </w:r>
+      <w:proofErr w:type="gramStart"/>
+      <w:r>
+        <w:rPr>
+          <w:b/>
+          <w:bCs/>
+          <w:color w:val="BF4E14" w:themeColor="accent2" w:themeShade="BF"/>
+        </w:rPr>
+        <w:t>app</w:t>
+      </w:r>
+      <w:r>
+        <w:rPr>
+          <w:b/>
+          <w:bCs/>
+        </w:rPr>
+        <w:t xml:space="preserve"> </w:t>
+      </w:r>
+      <w:r>
+        <w:rPr>
+          <w:b/>
+          <w:bCs/>
+          <w:color w:val="FF0000"/>
+        </w:rPr>
+        <w:t>.</w:t>
       </w:r>
       <w:proofErr w:type="gramEnd"/>
       <w:r>
@@ -6845,9 +6945,18 @@
         <w:rPr>
           <w:b/>
           <w:bCs/>
+          <w:color w:val="000000" w:themeColor="text1"/>
         </w:rPr>
         <w:lastRenderedPageBreak/>
-        <w:t>docker build</w:t>
+        <w:t>docker</w:t>
+      </w:r>
+      <w:r>
+        <w:rPr>
+          <w:b/>
+          <w:bCs/>
+          <w:color w:val="215E99" w:themeColor="text2" w:themeTint="BF"/>
+        </w:rPr>
+        <w:t xml:space="preserve"> build</w:t>
       </w:r>
       <w:r>
         <w:t xml:space="preserve">: This is the Docker </w:t>
@@ -6867,6 +6976,7 @@
         <w:rPr>
           <w:b/>
           <w:bCs/>
+          <w:color w:val="80340D" w:themeColor="accent2" w:themeShade="80"/>
         </w:rPr>
         <w:t>-t node-docker-app</w:t>
       </w:r>
@@ -6928,6 +7038,7 @@
         <w:rPr>
           <w:b/>
           <w:bCs/>
+          <w:color w:val="FF0000"/>
         </w:rPr>
         <w:t>.</w:t>
       </w:r>
@@ -6951,7 +7062,14 @@
     <w:p>
       <w:hyperlink r:id="rId63" w:tgtFrame="_blank" w:history="1">
         <w:r>
-          <w:t>In summary, this command tells Docker to create an image named node-docker-app using the Dockerfile located in the current directory</w:t>
+          <w:rPr>
+            <w:b/>
+            <w:bCs/>
+          </w:rPr>
+          <w:t>In summary</w:t>
+        </w:r>
+        <w:r>
+          <w:t>, this command tells Docker to create an image named node-docker-app using the Dockerfile located in the current directory</w:t>
         </w:r>
       </w:hyperlink>
       <w:r>
@@ -6959,8 +7077,58 @@
       </w:r>
     </w:p>
     <w:p>
-      <w:r>
-        <w:t>In Docker Desktop, click the Images vertical menu to view all the images.</w:t>
+      <w:pPr>
+        <w:pStyle w:val="Heading3"/>
+      </w:pPr>
+      <w:bookmarkStart w:id="40" w:name="_Toc185429663"/>
+      <w:r>
+        <w:t xml:space="preserve">Images </w:t>
+      </w:r>
+      <w:r>
+        <w:t>M</w:t>
+      </w:r>
+      <w:r>
+        <w:t>enu</w:t>
+      </w:r>
+      <w:bookmarkEnd w:id="40"/>
+    </w:p>
+    <w:p>
+      <w:r>
+        <w:t xml:space="preserve">In Docker Desktop, </w:t>
+      </w:r>
+      <w:r>
+        <w:rPr>
+          <w:b/>
+          <w:bCs/>
+        </w:rPr>
+        <w:t>click the</w:t>
+      </w:r>
+      <w:r>
+        <w:t xml:space="preserve"> </w:t>
+      </w:r>
+      <w:r>
+        <w:rPr>
+          <w:b/>
+          <w:bCs/>
+        </w:rPr>
+        <w:t xml:space="preserve">Images </w:t>
+      </w:r>
+      <w:r>
+        <w:rPr>
+          <w:b/>
+          <w:bCs/>
+        </w:rPr>
+        <w:t>M</w:t>
+      </w:r>
+      <w:r>
+        <w:rPr>
+          <w:b/>
+          <w:bCs/>
+        </w:rPr>
+        <w:t>enu</w:t>
+      </w:r>
+      <w:r>
+        <w:t xml:space="preserve"> to view all the images.</w:t>
       </w:r>
     </w:p>
     <w:p>
@@ -6972,9 +7140,9 @@
           <w:noProof/>
         </w:rPr>
         <w:drawing>
-          <wp:inline distT="0" distB="0" distL="0" distR="0" wp14:anchorId="4AF5F072" wp14:editId="581613B7">
-            <wp:extent cx="5593289" cy="1432384"/>
-            <wp:effectExtent l="0" t="0" r="7620" b="0"/>
+          <wp:inline distT="0" distB="0" distL="0" distR="0" wp14:anchorId="4AF5F072" wp14:editId="6F645042">
+            <wp:extent cx="4247519" cy="1087746"/>
+            <wp:effectExtent l="0" t="0" r="635" b="0"/>
             <wp:docPr id="716693606" name="Picture 1" descr="A screenshot of a computer&#10;&#10;Description automatically generated"/>
             <wp:cNvGraphicFramePr>
               <a:graphicFrameLocks xmlns:a="http://schemas.openxmlformats.org/drawingml/2006/main" noChangeAspect="1"/>
@@ -6995,7 +7163,7 @@
                   <pic:spPr>
                     <a:xfrm>
                       <a:off x="0" y="0"/>
-                      <a:ext cx="5630522" cy="1441919"/>
+                      <a:ext cx="4306802" cy="1102928"/>
                     </a:xfrm>
                     <a:prstGeom prst="rect">
                       <a:avLst/>
@@ -7024,10 +7192,17 @@
         <w:t xml:space="preserve">when </w:t>
       </w:r>
       <w:r>
-        <w:t xml:space="preserve">you can click on the </w:t>
-      </w:r>
-      <w:r>
-        <w:t xml:space="preserve">image name (node-docker-app) </w:t>
+        <w:t xml:space="preserve">you can </w:t>
+      </w:r>
+      <w:r>
+        <w:rPr>
+          <w:b/>
+          <w:bCs/>
+        </w:rPr>
+        <w:t>click on the image name (node-docker-app)</w:t>
+      </w:r>
+      <w:r>
+        <w:t xml:space="preserve"> </w:t>
       </w:r>
       <w:r>
         <w:t>you can</w:t>
@@ -7048,10 +7223,10 @@
           <w:noProof/>
         </w:rPr>
         <w:drawing>
-          <wp:inline distT="0" distB="0" distL="0" distR="0" wp14:anchorId="61FF2633" wp14:editId="146960C0">
-            <wp:extent cx="4021469" cy="2938766"/>
-            <wp:effectExtent l="0" t="0" r="0" b="0"/>
-            <wp:docPr id="485803136" name="Picture 1" descr="A screenshot of a computer&#10;&#10;Description automatically generated"/>
+          <wp:inline distT="0" distB="0" distL="0" distR="0" wp14:anchorId="10A69D33" wp14:editId="390EA96A">
+            <wp:extent cx="3243307" cy="2399562"/>
+            <wp:effectExtent l="0" t="0" r="0" b="1270"/>
+            <wp:docPr id="977753657" name="Picture 1" descr="A screenshot of a computer&#10;&#10;Description automatically generated"/>
             <wp:cNvGraphicFramePr>
               <a:graphicFrameLocks xmlns:a="http://schemas.openxmlformats.org/drawingml/2006/main" noChangeAspect="1"/>
             </wp:cNvGraphicFramePr>
@@ -7059,7 +7234,7 @@
               <a:graphicData uri="http://schemas.openxmlformats.org/drawingml/2006/picture">
                 <pic:pic xmlns:pic="http://schemas.openxmlformats.org/drawingml/2006/picture">
                   <pic:nvPicPr>
-                    <pic:cNvPr id="485803136" name="Picture 1" descr="A screenshot of a computer&#10;&#10;Description automatically generated"/>
+                    <pic:cNvPr id="977753657" name="Picture 1" descr="A screenshot of a computer&#10;&#10;Description automatically generated"/>
                     <pic:cNvPicPr/>
                   </pic:nvPicPr>
                   <pic:blipFill>
@@ -7071,7 +7246,7 @@
                   <pic:spPr>
                     <a:xfrm>
                       <a:off x="0" y="0"/>
-                      <a:ext cx="4025950" cy="2942041"/>
+                      <a:ext cx="3259024" cy="2411191"/>
                     </a:xfrm>
                     <a:prstGeom prst="rect">
                       <a:avLst/>
@@ -7097,60 +7272,80 @@
         <w:jc w:val="both"/>
       </w:pPr>
       <w:r>
+        <w:t xml:space="preserve">You can </w:t>
+      </w:r>
+      <w:r>
+        <w:rPr>
+          <w:b/>
+          <w:bCs/>
+        </w:rPr>
+        <w:t>see the image’s 15 layers and the hierarchy</w:t>
+      </w:r>
+      <w:r>
+        <w:t xml:space="preserve">, which is based on the Linux distribution that forms the base image. </w:t>
+      </w:r>
+      <w:r>
+        <w:t>See Figure 5.1</w:t>
+      </w:r>
+    </w:p>
+    <w:p>
+      <w:pPr>
+        <w:pStyle w:val="Heading2"/>
+      </w:pPr>
+      <w:bookmarkStart w:id="41" w:name="_Toc183807747"/>
+      <w:bookmarkStart w:id="42" w:name="_Toc185326587"/>
+      <w:bookmarkStart w:id="43" w:name="_Toc185429664"/>
+      <w:r>
         <w:lastRenderedPageBreak/>
-        <w:t xml:space="preserve">You can see the </w:t>
-      </w:r>
-      <w:r>
-        <w:t xml:space="preserve">image’s 15 layers and the hierarchy, which is based on the Linux distribution that forms the base image. </w:t>
-      </w:r>
-      <w:r>
-        <w:t>See Figure 5.1</w:t>
-      </w:r>
-    </w:p>
-    <w:p>
-      <w:pPr>
-        <w:pStyle w:val="Heading2"/>
-      </w:pPr>
-      <w:bookmarkStart w:id="40" w:name="_Toc183807747"/>
-      <w:bookmarkStart w:id="41" w:name="_Toc185326587"/>
-      <w:bookmarkStart w:id="42" w:name="_Toc185339160"/>
-      <w:r>
         <w:t>Starting the Container</w:t>
       </w:r>
-      <w:bookmarkEnd w:id="40"/>
       <w:bookmarkEnd w:id="41"/>
       <w:bookmarkEnd w:id="42"/>
+      <w:bookmarkEnd w:id="43"/>
     </w:p>
     <w:p>
       <w:r>
         <w:t xml:space="preserve">In the </w:t>
+      </w:r>
+      <w:r>
+        <w:t xml:space="preserve">README </w:t>
+      </w:r>
+      <w:r>
+        <w:t xml:space="preserve">file on GitHub, there is a section titled </w:t>
+      </w:r>
+      <w:r>
+        <w:t xml:space="preserve">Usage Instructions </w:t>
+      </w:r>
+      <w:r>
+        <w:t xml:space="preserve">where I explain </w:t>
       </w:r>
       <w:r>
         <w:rPr>
           <w:b/>
           <w:bCs/>
         </w:rPr>
-        <w:t>README</w:t>
-      </w:r>
-      <w:r>
-        <w:t xml:space="preserve"> file on GitHub, there is a section titled ‘</w:t>
+        <w:t>H</w:t>
       </w:r>
       <w:r>
         <w:rPr>
           <w:b/>
           <w:bCs/>
         </w:rPr>
-        <w:t>Usage Instructions</w:t>
-      </w:r>
-      <w:r>
-        <w:t xml:space="preserve"> where I explain </w:t>
+        <w:t xml:space="preserve">ow to start the Docker </w:t>
       </w:r>
       <w:r>
         <w:rPr>
           <w:b/>
           <w:bCs/>
         </w:rPr>
-        <w:t>how to start the Docker container</w:t>
+        <w:t>C</w:t>
+      </w:r>
+      <w:r>
+        <w:rPr>
+          <w:b/>
+          <w:bCs/>
+        </w:rPr>
+        <w:t>ontainer</w:t>
       </w:r>
       <w:r>
         <w:t xml:space="preserve">. </w:t>
@@ -7259,7 +7454,14 @@
     <w:p>
       <w:hyperlink r:id="rId66" w:tgtFrame="_blank" w:history="1">
         <w:r>
-          <w:t>In summary, this command starts a container from the node-docker-app image and maps port 3000 on your local machine to port 3000 in the container, allowing you to access the application running inside the container via http://localhost:3000</w:t>
+          <w:rPr>
+            <w:b/>
+            <w:bCs/>
+          </w:rPr>
+          <w:t>In summary</w:t>
+        </w:r>
+        <w:r>
+          <w:t>, this command starts a container from the node-docker-app image and maps port 3000 on your local machine to port 3000 in the container, allowing you to access the application running inside the container via http://localhost:3000</w:t>
         </w:r>
       </w:hyperlink>
       <w:r>
@@ -7292,9 +7494,9 @@
           <w:noProof/>
         </w:rPr>
         <w:drawing>
-          <wp:inline distT="0" distB="0" distL="0" distR="0" wp14:anchorId="29B160A5" wp14:editId="0A9F8920">
-            <wp:extent cx="6458244" cy="1625600"/>
-            <wp:effectExtent l="0" t="0" r="0" b="0"/>
+          <wp:inline distT="0" distB="0" distL="0" distR="0" wp14:anchorId="29B160A5" wp14:editId="70884EE3">
+            <wp:extent cx="4834684" cy="1477775"/>
+            <wp:effectExtent l="0" t="0" r="4445" b="8255"/>
             <wp:docPr id="1261112474" name="Picture 1" descr="A screenshot of a computer&#10;&#10;Description automatically generated"/>
             <wp:cNvGraphicFramePr>
               <a:graphicFrameLocks xmlns:a="http://schemas.openxmlformats.org/drawingml/2006/main" noChangeAspect="1"/>
@@ -7315,7 +7517,7 @@
                   <pic:spPr>
                     <a:xfrm>
                       <a:off x="0" y="0"/>
-                      <a:ext cx="6492503" cy="1634223"/>
+                      <a:ext cx="4935752" cy="1508668"/>
                     </a:xfrm>
                     <a:prstGeom prst="rect">
                       <a:avLst/>
@@ -7380,9 +7582,9 @@
       <w:pPr>
         <w:pStyle w:val="Heading2"/>
       </w:pPr>
-      <w:bookmarkStart w:id="43" w:name="_Toc183807748"/>
-      <w:bookmarkStart w:id="44" w:name="_Toc185326588"/>
-      <w:bookmarkStart w:id="45" w:name="_Toc185339161"/>
+      <w:bookmarkStart w:id="44" w:name="_Toc183807748"/>
+      <w:bookmarkStart w:id="45" w:name="_Toc185326588"/>
+      <w:bookmarkStart w:id="46" w:name="_Toc185429665"/>
       <w:r>
         <w:lastRenderedPageBreak/>
         <w:t>C</w:t>
@@ -7396,9 +7598,9 @@
       <w:r>
         <w:t>ine</w:t>
       </w:r>
-      <w:bookmarkEnd w:id="43"/>
       <w:bookmarkEnd w:id="44"/>
       <w:bookmarkEnd w:id="45"/>
+      <w:bookmarkEnd w:id="46"/>
     </w:p>
     <w:p>
       <w:pPr>
@@ -7462,15 +7664,15 @@
       <w:pPr>
         <w:pStyle w:val="Heading2"/>
       </w:pPr>
-      <w:bookmarkStart w:id="46" w:name="_Toc183807749"/>
-      <w:bookmarkStart w:id="47" w:name="_Toc185326589"/>
-      <w:bookmarkStart w:id="48" w:name="_Toc185339162"/>
+      <w:bookmarkStart w:id="47" w:name="_Toc183807749"/>
+      <w:bookmarkStart w:id="48" w:name="_Toc185326589"/>
+      <w:bookmarkStart w:id="49" w:name="_Toc185429666"/>
       <w:r>
         <w:t>File Structure</w:t>
       </w:r>
-      <w:bookmarkEnd w:id="46"/>
       <w:bookmarkEnd w:id="47"/>
       <w:bookmarkEnd w:id="48"/>
+      <w:bookmarkEnd w:id="49"/>
     </w:p>
     <w:p>
       <w:pPr>
@@ -7537,15 +7739,15 @@
       <w:pPr>
         <w:pStyle w:val="Heading2"/>
       </w:pPr>
-      <w:bookmarkStart w:id="49" w:name="_Toc183807750"/>
-      <w:bookmarkStart w:id="50" w:name="_Toc185326590"/>
-      <w:bookmarkStart w:id="51" w:name="_Toc185339163"/>
+      <w:bookmarkStart w:id="50" w:name="_Toc183807750"/>
+      <w:bookmarkStart w:id="51" w:name="_Toc185326590"/>
+      <w:bookmarkStart w:id="52" w:name="_Toc185429667"/>
       <w:r>
         <w:t>Website in the Container</w:t>
       </w:r>
-      <w:bookmarkEnd w:id="49"/>
       <w:bookmarkEnd w:id="50"/>
       <w:bookmarkEnd w:id="51"/>
+      <w:bookmarkEnd w:id="52"/>
     </w:p>
     <w:p>
       <w:r>
@@ -7613,15 +7815,15 @@
       <w:pPr>
         <w:pStyle w:val="Heading2"/>
       </w:pPr>
-      <w:bookmarkStart w:id="52" w:name="_Toc183807751"/>
-      <w:bookmarkStart w:id="53" w:name="_Toc185326591"/>
-      <w:bookmarkStart w:id="54" w:name="_Toc185339164"/>
+      <w:bookmarkStart w:id="53" w:name="_Toc183807751"/>
+      <w:bookmarkStart w:id="54" w:name="_Toc185326591"/>
+      <w:bookmarkStart w:id="55" w:name="_Toc185429668"/>
       <w:r>
         <w:t>Difference Between RUN and CMD in Dockerfile</w:t>
       </w:r>
-      <w:bookmarkEnd w:id="52"/>
       <w:bookmarkEnd w:id="53"/>
       <w:bookmarkEnd w:id="54"/>
+      <w:bookmarkEnd w:id="55"/>
     </w:p>
     <w:p>
       <w:pPr>
@@ -7652,15 +7854,15 @@
       <w:pPr>
         <w:pStyle w:val="Heading3"/>
       </w:pPr>
-      <w:bookmarkStart w:id="55" w:name="_Toc183807752"/>
-      <w:bookmarkStart w:id="56" w:name="_Toc185326592"/>
-      <w:bookmarkStart w:id="57" w:name="_Toc185339165"/>
+      <w:bookmarkStart w:id="56" w:name="_Toc183807752"/>
+      <w:bookmarkStart w:id="57" w:name="_Toc185326592"/>
+      <w:bookmarkStart w:id="58" w:name="_Toc185429669"/>
       <w:r>
         <w:t>RUN instruction</w:t>
       </w:r>
-      <w:bookmarkEnd w:id="55"/>
       <w:bookmarkEnd w:id="56"/>
       <w:bookmarkEnd w:id="57"/>
+      <w:bookmarkEnd w:id="58"/>
     </w:p>
     <w:p>
       <w:pPr>
@@ -7703,17 +7905,14 @@
       <w:pPr>
         <w:pStyle w:val="Heading3"/>
       </w:pPr>
-      <w:bookmarkStart w:id="58" w:name="_Toc185339166"/>
-      <w:r>
-        <w:t>CMD</w:t>
-      </w:r>
-      <w:r>
-        <w:t xml:space="preserve"> </w:t>
+      <w:bookmarkStart w:id="59" w:name="_Toc185429670"/>
+      <w:r>
+        <w:t xml:space="preserve">CMD </w:t>
       </w:r>
       <w:r>
         <w:t>instruction</w:t>
       </w:r>
-      <w:bookmarkEnd w:id="58"/>
+      <w:bookmarkEnd w:id="59"/>
     </w:p>
     <w:p>
       <w:pPr>
@@ -7767,9 +7966,9 @@
       <w:pPr>
         <w:pStyle w:val="Heading3"/>
       </w:pPr>
-      <w:bookmarkStart w:id="59" w:name="_Toc183807753"/>
-      <w:bookmarkStart w:id="60" w:name="_Toc185326593"/>
-      <w:bookmarkStart w:id="61" w:name="_Toc185339167"/>
+      <w:bookmarkStart w:id="60" w:name="_Toc183807753"/>
+      <w:bookmarkStart w:id="61" w:name="_Toc185326593"/>
+      <w:bookmarkStart w:id="62" w:name="_Toc185429671"/>
       <w:r>
         <w:t>S</w:t>
       </w:r>
@@ -7785,9 +7984,9 @@
       <w:r>
         <w:t> instruction</w:t>
       </w:r>
-      <w:bookmarkEnd w:id="59"/>
       <w:bookmarkEnd w:id="60"/>
       <w:bookmarkEnd w:id="61"/>
+      <w:bookmarkEnd w:id="62"/>
     </w:p>
     <w:p>
       <w:pPr>

</xml_diff>